<commit_message>
Rename subsection 2.1 in dissertation draft to include platform choice
Co-Authored-By: Claude Opus 5.5 <noreply@anthropic.com>
</commit_message>
<xml_diff>
--- a/Dissertation.docx
+++ b/Dissertation.docx
@@ -1354,7 +1354,7 @@
                 <w:rStyle w:val="Hyperlink"/>
                 <w:noProof/>
               </w:rPr>
-              <w:t>2.1 Вимоги до хмарно-нативної реалізації</w:t>
+              <w:t>2.1 Вимоги до реалізації та вибір платформи</w:t>
             </w:r>
             <w:r>
               <w:rPr>
@@ -4639,7 +4639,7 @@
       </w:pPr>
       <w:bookmarkStart w:id="16" w:name="_Toc242142608"/>
       <w:r>
-        <w:t>2.1 Вимоги до хмарно-нативної реалізації</w:t>
+        <w:t>2.1 Вимоги до реалізації та вибір платформи</w:t>
       </w:r>
       <w:bookmarkEnd w:id="16"/>
     </w:p>

</xml_diff>